<commit_message>
Descripción clara y concisa de los cambios realizados
</commit_message>
<xml_diff>
--- a/plantilla_carta.docx
+++ b/plantilla_carta.docx
@@ -1375,16 +1375,6 @@
         </w:rPr>
         <w:t> Nuevos soles, afecto a descuentos de Ley.</w:t>
       </w:r>
-      <w:r>
-        <w:rPr>
-          <w:rFonts w:eastAsia="Times New Roman"/>
-          <w:color w:val="222222"/>
-          <w:sz w:val="20"/>
-          <w:szCs w:val="20"/>
-          <w:lang w:val="es-ES"/>
-        </w:rPr>
-        <w:t xml:space="preserve"> (Según sea doctorado o maestría en caso de maestría la remuneración es 4140 en caso de doctorado es 5900, desde aquí lo demás es constante)</w:t>
-      </w:r>
     </w:p>
     <w:p>
       <w:pPr>
@@ -2259,7 +2249,6 @@
           <w:szCs w:val="20"/>
           <w:lang w:val="es-ES"/>
         </w:rPr>
-        <w:lastRenderedPageBreak/>
         <w:t xml:space="preserve">NOTA: </w:t>
       </w:r>
     </w:p>
@@ -2289,6 +2278,7 @@
           <w:color w:val="222222"/>
           <w:lang w:val="es-ES"/>
         </w:rPr>
+        <w:lastRenderedPageBreak/>
         <w:t>A la culminación de la asignatura deberá entregar el informe del desarrollo de la asignatura, requisito indispensable para el trámite de pago por el servicio brindado.</w:t>
       </w:r>
     </w:p>
@@ -3931,7 +3921,7 @@
     <w:charset w:val="00"/>
     <w:family w:val="swiss"/>
     <w:pitch w:val="variable"/>
-    <w:sig w:usb0="E4002EFF" w:usb1="C200247B" w:usb2="00000009" w:usb3="00000000" w:csb0="000001FF" w:csb1="00000000"/>
+    <w:sig w:usb0="E4002EFF" w:usb1="C000247B" w:usb2="00000009" w:usb3="00000000" w:csb0="000001FF" w:csb1="00000000"/>
   </w:font>
   <w:font w:name="Times New Roman">
     <w:panose1 w:val="02020603050405020304"/>
@@ -3987,7 +3977,7 @@
     <w:charset w:val="00"/>
     <w:family w:val="swiss"/>
     <w:pitch w:val="variable"/>
-    <w:sig w:usb0="E4002EFF" w:usb1="C200247B" w:usb2="00000009" w:usb3="00000000" w:csb0="000001FF" w:csb1="00000000"/>
+    <w:sig w:usb0="E4002EFF" w:usb1="C000247B" w:usb2="00000009" w:usb3="00000000" w:csb0="000001FF" w:csb1="00000000"/>
   </w:font>
 </w:fonts>
 </file>
@@ -4018,6 +4008,7 @@
     <w:rsid w:val="002D7453"/>
     <w:rsid w:val="003B15F2"/>
     <w:rsid w:val="00557AD9"/>
+    <w:rsid w:val="005C75B8"/>
     <w:rsid w:val="005E3512"/>
     <w:rsid w:val="005E5642"/>
     <w:rsid w:val="006307E6"/>
@@ -4062,7 +4053,7 @@
   </m:mathPr>
   <w:themeFontLang w:val="es-PE"/>
   <w:clrSchemeMapping w:bg1="light1" w:t1="dark1" w:bg2="light2" w:t2="dark2" w:accent1="accent1" w:accent2="accent2" w:accent3="accent3" w:accent4="accent4" w:accent5="accent5" w:accent6="accent6" w:hyperlink="hyperlink" w:followedHyperlink="followedHyperlink"/>
-  <w:decimalSymbol w:val=","/>
+  <w:decimalSymbol w:val="."/>
   <w:listSeparator w:val=";"/>
   <w15:chartTrackingRefBased/>
 </w:settings>

</xml_diff>